<commit_message>
Seminar 2: spell Natalia Pidmurniak, say online seminar, name moderator
- Natalia Pidmurniak spelling across agenda, certificate, email and form.
- "Online seminar" in the agenda header, certificate line and email.
- Prof. Olesya Hulchiy named as moderator of the panel and closing.

Co-Authored-By: Claude Opus 5.5 <noreply@anthropic.com>
Claude-Session: https://claude.ai/code/session_018BmcSTSDJm7Z5KPUPDSdGg
</commit_message>
<xml_diff>
--- a/seminar2/Seminar2_Agenda.docx
+++ b/seminar2/Seminar2_Agenda.docx
@@ -43,7 +43,7 @@
         <w:rPr>
           <w:color w:val="595959"/>
         </w:rPr>
-        <w:t xml:space="preserve">Wednesday, 4 November 2026  ·  13:00–15:30 CET (14:00–16:30 EEST)  ·  Online (Zoom)  ·  English</w:t>
+        <w:t xml:space="preserve">Wednesday, 4 November 2026  ·  13:00–15:30 CET (14:00–16:30 EEST)  ·  Online seminar (Zoom)  ·  English</w:t>
       </w:r>
     </w:p>
     <w:p>
@@ -635,7 +635,7 @@
                 <w:sz w:val="21"/>
                 <w:szCs w:val="21"/>
               </w:rPr>
-              <w:t xml:space="preserve">Natalya Pidmurniak</w:t>
+              <w:t xml:space="preserve">Natalia Pidmurniak</w:t>
             </w:r>
           </w:p>
         </w:tc>
@@ -697,7 +697,7 @@
                 <w:sz w:val="19"/>
                 <w:szCs w:val="19"/>
               </w:rPr>
-              <w:t xml:space="preserve">Moderated discussion around 2–3 focus questions, drawn from participants’ questions submitted in advance. Speakers + floor.</w:t>
+              <w:t xml:space="preserve">Moderated by Prof. Olesya Hulchiy around 2–3 focus questions, drawn from participants’ questions submitted in advance. Speakers + floor.</w:t>
             </w:r>
           </w:p>
         </w:tc>
@@ -798,7 +798,7 @@
                 <w:sz w:val="21"/>
                 <w:szCs w:val="21"/>
               </w:rPr>
-              <w:t xml:space="preserve">Moderator</w:t>
+              <w:t xml:space="preserve">Prof. Olesya Hulchiy</w:t>
             </w:r>
           </w:p>
         </w:tc>

</xml_diff>

<commit_message>
Seminar 2 agenda: replace paradox section with a single teaser
The two-question paradox block and its framing text are replaced by one
question in a highlighted box under the title. Spacing loosened to fill
the page; still one page.

Co-Authored-By: Claude Opus 5.5 <noreply@anthropic.com>
Claude-Session: https://claude.ai/code/session_018BmcSTSDJm7Z5KPUPDSdGg
</commit_message>
<xml_diff>
--- a/seminar2/Seminar2_Agenda.docx
+++ b/seminar2/Seminar2_Agenda.docx
@@ -36,7 +36,7 @@
     </w:p>
     <w:p>
       <w:pPr>
-        <w:spacing w:after="120"/>
+        <w:spacing w:after="280"/>
         <w:jc w:val="center"/>
       </w:pPr>
       <w:r>
@@ -46,10 +46,77 @@
         <w:t xml:space="preserve">Wednesday, 4 November 2026  ·  13:00–15:30 CET (14:00–16:30 EEST)  ·  Online seminar (Zoom)  ·  English</w:t>
       </w:r>
     </w:p>
+    <w:tbl>
+      <w:tblPr>
+        <w:tblW w:type="dxa" w:w="9746"/>
+        <w:tblBorders>
+          <w:top w:val="none" w:color="FFFFFF" w:sz="0"/>
+          <w:left w:val="none" w:color="FFFFFF" w:sz="0"/>
+          <w:bottom w:val="none" w:color="FFFFFF" w:sz="0"/>
+          <w:right w:val="none" w:color="FFFFFF" w:sz="0"/>
+          <w:insideH w:val="none" w:color="FFFFFF" w:sz="0"/>
+          <w:insideV w:val="none" w:color="FFFFFF" w:sz="0"/>
+        </w:tblBorders>
+      </w:tblPr>
+      <w:tblGrid>
+        <w:gridCol w:w="9746"/>
+      </w:tblGrid>
+      <w:tr>
+        <w:tc>
+          <w:tcPr>
+            <w:tcW w:type="dxa" w:w="9746"/>
+            <w:tcBorders>
+              <w:top w:val="none" w:color="FFFFFF" w:sz="0"/>
+              <w:left w:val="single" w:color="2E74B5" w:sz="18"/>
+              <w:bottom w:val="none" w:color="FFFFFF" w:sz="0"/>
+              <w:right w:val="none" w:color="FFFFFF" w:sz="0"/>
+            </w:tcBorders>
+            <w:shd w:fill="EAF1F8" w:color="auto" w:val="clear"/>
+            <w:tcMar>
+              <w:top w:type="dxa" w:w="150"/>
+              <w:left w:type="dxa" w:w="220"/>
+              <w:bottom w:type="dxa" w:w="150"/>
+              <w:right w:type="dxa" w:w="220"/>
+            </w:tcMar>
+          </w:tcPr>
+          <w:p>
+            <w:pPr>
+              <w:spacing w:after="40"/>
+            </w:pPr>
+            <w:r>
+              <w:rPr>
+                <w:b/>
+                <w:bCs/>
+                <w:color w:val="2E74B5"/>
+                <w:spacing w:val="20"/>
+                <w:sz w:val="18"/>
+                <w:szCs w:val="18"/>
+              </w:rPr>
+              <w:t xml:space="preserve">THE PARADOX</w:t>
+            </w:r>
+          </w:p>
+          <w:p>
+            <w:pPr>
+              <w:spacing w:after="0"/>
+            </w:pPr>
+            <w:r>
+              <w:rPr>
+                <w:b/>
+                <w:bCs/>
+                <w:color w:val="1F4E79"/>
+                <w:sz w:val="26"/>
+                <w:szCs w:val="26"/>
+              </w:rPr>
+              <w:t xml:space="preserve">Why — and how — does a country under daily attack become a security donor?</w:t>
+            </w:r>
+          </w:p>
+        </w:tc>
+      </w:tr>
+    </w:tbl>
     <w:p>
       <w:pPr>
         <w:pStyle w:val="Heading2"/>
-        <w:spacing w:after="40" w:before="140"/>
+        <w:spacing w:after="80" w:before="240"/>
       </w:pPr>
       <w:r>
         <w:t xml:space="preserve">Concept</w:t>
@@ -68,163 +135,7 @@
     <w:p>
       <w:pPr>
         <w:pStyle w:val="Heading2"/>
-        <w:spacing w:after="40" w:before="140"/>
-      </w:pPr>
-      <w:r>
-        <w:t xml:space="preserve">The Paradox</w:t>
-      </w:r>
-    </w:p>
-    <w:p>
-      <w:r>
-        <w:t xml:space="preserve">During Seminar 1, a question was raised that remained unanswered. Prof. Hulchiy will open this seminar by returning to it — as a recap of what was discussed and as a frame for what follows.</w:t>
-      </w:r>
-    </w:p>
-    <w:p>
-      <w:pPr>
-        <w:spacing w:after="100"/>
-      </w:pPr>
-      <w:r>
-        <w:rPr>
-          <w:i/>
-          <w:iCs/>
-        </w:rPr>
-        <w:t xml:space="preserve">This seminar is built around a paradox — or perhaps two sides of the same question:</w:t>
-      </w:r>
-    </w:p>
-    <w:tbl>
-      <w:tblPr>
-        <w:tblW w:type="dxa" w:w="9746"/>
-        <w:tblBorders>
-          <w:top w:val="none" w:color="FFFFFF" w:sz="0"/>
-          <w:left w:val="none" w:color="FFFFFF" w:sz="0"/>
-          <w:bottom w:val="none" w:color="FFFFFF" w:sz="0"/>
-          <w:right w:val="none" w:color="FFFFFF" w:sz="0"/>
-          <w:insideH w:val="none" w:color="FFFFFF" w:sz="0"/>
-          <w:insideV w:val="none" w:color="FFFFFF" w:sz="0"/>
-        </w:tblBorders>
-      </w:tblPr>
-      <w:tblGrid>
-        <w:gridCol w:w="4813"/>
-        <w:gridCol w:w="120"/>
-        <w:gridCol w:w="4813"/>
-      </w:tblGrid>
-      <w:tr>
-        <w:tc>
-          <w:tcPr>
-            <w:tcW w:type="dxa" w:w="4813"/>
-            <w:tcBorders>
-              <w:top w:val="none" w:color="FFFFFF" w:sz="0"/>
-              <w:left w:val="single" w:color="2E74B5" w:sz="18"/>
-              <w:bottom w:val="none" w:color="FFFFFF" w:sz="0"/>
-              <w:right w:val="none" w:color="FFFFFF" w:sz="0"/>
-            </w:tcBorders>
-            <w:shd w:fill="EAF1F8" w:color="auto" w:val="clear"/>
-            <w:tcMar>
-              <w:top w:type="dxa" w:w="90"/>
-              <w:left w:type="dxa" w:w="140"/>
-              <w:bottom w:type="dxa" w:w="90"/>
-              <w:right w:type="dxa" w:w="140"/>
-            </w:tcMar>
-          </w:tcPr>
-          <w:p>
-            <w:pPr>
-              <w:spacing w:after="30"/>
-            </w:pPr>
-            <w:r>
-              <w:rPr>
-                <w:b/>
-                <w:bCs/>
-                <w:color w:val="1F4E79"/>
-              </w:rPr>
-              <w:t xml:space="preserve">Why does a country under daily attack choose to become a security donor?</w:t>
-            </w:r>
-          </w:p>
-          <w:p>
-            <w:r>
-              <w:rPr>
-                <w:i/>
-                <w:iCs/>
-                <w:color w:val="595959"/>
-                <w:sz w:val="20"/>
-                <w:szCs w:val="20"/>
-              </w:rPr>
-              <w:t xml:space="preserve">(What drives a nation to give when it is under threat?)</w:t>
-            </w:r>
-          </w:p>
-        </w:tc>
-        <w:tc>
-          <w:tcPr>
-            <w:tcW w:type="dxa" w:w="120"/>
-            <w:tcBorders>
-              <w:top w:val="none" w:color="FFFFFF" w:sz="0"/>
-              <w:left w:val="none" w:color="FFFFFF" w:sz="0"/>
-              <w:bottom w:val="none" w:color="FFFFFF" w:sz="0"/>
-              <w:right w:val="none" w:color="FFFFFF" w:sz="0"/>
-            </w:tcBorders>
-          </w:tcPr>
-          <w:p/>
-        </w:tc>
-        <w:tc>
-          <w:tcPr>
-            <w:tcW w:type="dxa" w:w="4813"/>
-            <w:tcBorders>
-              <w:top w:val="none" w:color="FFFFFF" w:sz="0"/>
-              <w:left w:val="single" w:color="2E74B5" w:sz="18"/>
-              <w:bottom w:val="none" w:color="FFFFFF" w:sz="0"/>
-              <w:right w:val="none" w:color="FFFFFF" w:sz="0"/>
-            </w:tcBorders>
-            <w:shd w:fill="EAF1F8" w:color="auto" w:val="clear"/>
-            <w:tcMar>
-              <w:top w:type="dxa" w:w="90"/>
-              <w:left w:type="dxa" w:w="140"/>
-              <w:bottom w:type="dxa" w:w="90"/>
-              <w:right w:type="dxa" w:w="140"/>
-            </w:tcMar>
-          </w:tcPr>
-          <w:p>
-            <w:pPr>
-              <w:spacing w:after="30"/>
-            </w:pPr>
-            <w:r>
-              <w:rPr>
-                <w:b/>
-                <w:bCs/>
-                <w:color w:val="1F4E79"/>
-              </w:rPr>
-              <w:t xml:space="preserve">How can a country in acute need contribute anything to others at all?</w:t>
-            </w:r>
-          </w:p>
-          <w:p>
-            <w:r>
-              <w:rPr>
-                <w:i/>
-                <w:iCs/>
-                <w:color w:val="595959"/>
-                <w:sz w:val="20"/>
-                <w:szCs w:val="20"/>
-              </w:rPr>
-              <w:t xml:space="preserve">(Where does the capacity come from?)</w:t>
-            </w:r>
-          </w:p>
-        </w:tc>
-      </w:tr>
-    </w:tbl>
-    <w:p>
-      <w:pPr>
-        <w:spacing w:after="40" w:before="100"/>
-      </w:pPr>
-      <w:r>
-        <w:rPr>
-          <w:i/>
-          <w:iCs/>
-        </w:rPr>
-        <w:t xml:space="preserve">You don’t have to choose one. But by the end of today, we hope you’ll have your own answer.</w:t>
-      </w:r>
-    </w:p>
-    <w:p>
-      <w:pPr>
-        <w:pStyle w:val="Heading2"/>
-        <w:spacing w:after="40" w:before="140"/>
+        <w:spacing w:after="80" w:before="240"/>
       </w:pPr>
       <w:r>
         <w:t xml:space="preserve">Programme</w:t>
@@ -256,10 +167,10 @@
             <w:tcW w:type="dxa" w:w="1150"/>
             <w:shd w:fill="1F4E79" w:color="auto" w:val="clear"/>
             <w:tcMar>
-              <w:top w:type="dxa" w:w="45"/>
-              <w:left w:type="dxa" w:w="100"/>
-              <w:bottom w:type="dxa" w:w="45"/>
-              <w:right w:type="dxa" w:w="100"/>
+              <w:top w:type="dxa" w:w="70"/>
+              <w:left w:type="dxa" w:w="110"/>
+              <w:bottom w:type="dxa" w:w="60"/>
+              <w:right w:type="dxa" w:w="110"/>
             </w:tcMar>
           </w:tcPr>
           <w:p>
@@ -280,10 +191,10 @@
             <w:tcW w:type="dxa" w:w="6196"/>
             <w:shd w:fill="1F4E79" w:color="auto" w:val="clear"/>
             <w:tcMar>
-              <w:top w:type="dxa" w:w="45"/>
-              <w:left w:type="dxa" w:w="100"/>
-              <w:bottom w:type="dxa" w:w="45"/>
-              <w:right w:type="dxa" w:w="100"/>
+              <w:top w:type="dxa" w:w="70"/>
+              <w:left w:type="dxa" w:w="110"/>
+              <w:bottom w:type="dxa" w:w="60"/>
+              <w:right w:type="dxa" w:w="110"/>
             </w:tcMar>
           </w:tcPr>
           <w:p>
@@ -304,10 +215,10 @@
             <w:tcW w:type="dxa" w:w="2400"/>
             <w:shd w:fill="1F4E79" w:color="auto" w:val="clear"/>
             <w:tcMar>
-              <w:top w:type="dxa" w:w="45"/>
-              <w:left w:type="dxa" w:w="100"/>
-              <w:bottom w:type="dxa" w:w="45"/>
-              <w:right w:type="dxa" w:w="100"/>
+              <w:top w:type="dxa" w:w="70"/>
+              <w:left w:type="dxa" w:w="110"/>
+              <w:bottom w:type="dxa" w:w="60"/>
+              <w:right w:type="dxa" w:w="110"/>
             </w:tcMar>
           </w:tcPr>
           <w:p>
@@ -333,10 +244,10 @@
             <w:tcW w:type="dxa" w:w="1150"/>
             <w:shd w:fill="F2F2F2" w:color="auto" w:val="clear"/>
             <w:tcMar>
-              <w:top w:type="dxa" w:w="45"/>
-              <w:left w:type="dxa" w:w="100"/>
-              <w:bottom w:type="dxa" w:w="45"/>
-              <w:right w:type="dxa" w:w="100"/>
+              <w:top w:type="dxa" w:w="70"/>
+              <w:left w:type="dxa" w:w="110"/>
+              <w:bottom w:type="dxa" w:w="60"/>
+              <w:right w:type="dxa" w:w="110"/>
             </w:tcMar>
           </w:tcPr>
           <w:p>
@@ -354,10 +265,10 @@
             <w:tcW w:type="dxa" w:w="6196"/>
             <w:shd w:fill="F2F2F2" w:color="auto" w:val="clear"/>
             <w:tcMar>
-              <w:top w:type="dxa" w:w="45"/>
-              <w:left w:type="dxa" w:w="100"/>
-              <w:bottom w:type="dxa" w:w="45"/>
-              <w:right w:type="dxa" w:w="100"/>
+              <w:top w:type="dxa" w:w="70"/>
+              <w:left w:type="dxa" w:w="110"/>
+              <w:bottom w:type="dxa" w:w="60"/>
+              <w:right w:type="dxa" w:w="110"/>
             </w:tcMar>
           </w:tcPr>
           <w:p>
@@ -381,7 +292,7 @@
                 <w:sz w:val="19"/>
                 <w:szCs w:val="19"/>
               </w:rPr>
-              <w:t xml:space="preserve">Key findings from the first seminar and the two questions that frame the discussion ahead.</w:t>
+              <w:t xml:space="preserve">Key findings from the first seminar and the paradox that frames the discussion ahead.</w:t>
             </w:r>
           </w:p>
         </w:tc>
@@ -390,10 +301,10 @@
             <w:tcW w:type="dxa" w:w="2400"/>
             <w:shd w:fill="F2F2F2" w:color="auto" w:val="clear"/>
             <w:tcMar>
-              <w:top w:type="dxa" w:w="45"/>
-              <w:left w:type="dxa" w:w="100"/>
-              <w:bottom w:type="dxa" w:w="45"/>
-              <w:right w:type="dxa" w:w="100"/>
+              <w:top w:type="dxa" w:w="70"/>
+              <w:left w:type="dxa" w:w="110"/>
+              <w:bottom w:type="dxa" w:w="60"/>
+              <w:right w:type="dxa" w:w="110"/>
             </w:tcMar>
           </w:tcPr>
           <w:p>
@@ -415,10 +326,10 @@
           <w:tcPr>
             <w:tcW w:type="dxa" w:w="1150"/>
             <w:tcMar>
-              <w:top w:type="dxa" w:w="45"/>
-              <w:left w:type="dxa" w:w="100"/>
-              <w:bottom w:type="dxa" w:w="45"/>
-              <w:right w:type="dxa" w:w="100"/>
+              <w:top w:type="dxa" w:w="70"/>
+              <w:left w:type="dxa" w:w="110"/>
+              <w:bottom w:type="dxa" w:w="60"/>
+              <w:right w:type="dxa" w:w="110"/>
             </w:tcMar>
           </w:tcPr>
           <w:p>
@@ -435,10 +346,10 @@
           <w:tcPr>
             <w:tcW w:type="dxa" w:w="6196"/>
             <w:tcMar>
-              <w:top w:type="dxa" w:w="45"/>
-              <w:left w:type="dxa" w:w="100"/>
-              <w:bottom w:type="dxa" w:w="45"/>
-              <w:right w:type="dxa" w:w="100"/>
+              <w:top w:type="dxa" w:w="70"/>
+              <w:left w:type="dxa" w:w="110"/>
+              <w:bottom w:type="dxa" w:w="60"/>
+              <w:right w:type="dxa" w:w="110"/>
             </w:tcMar>
           </w:tcPr>
           <w:p>
@@ -470,10 +381,10 @@
           <w:tcPr>
             <w:tcW w:type="dxa" w:w="2400"/>
             <w:tcMar>
-              <w:top w:type="dxa" w:w="45"/>
-              <w:left w:type="dxa" w:w="100"/>
-              <w:bottom w:type="dxa" w:w="45"/>
-              <w:right w:type="dxa" w:w="100"/>
+              <w:top w:type="dxa" w:w="70"/>
+              <w:left w:type="dxa" w:w="110"/>
+              <w:bottom w:type="dxa" w:w="60"/>
+              <w:right w:type="dxa" w:w="110"/>
             </w:tcMar>
           </w:tcPr>
           <w:p>
@@ -496,10 +407,10 @@
             <w:tcW w:type="dxa" w:w="1150"/>
             <w:shd w:fill="F2F2F2" w:color="auto" w:val="clear"/>
             <w:tcMar>
-              <w:top w:type="dxa" w:w="45"/>
-              <w:left w:type="dxa" w:w="100"/>
-              <w:bottom w:type="dxa" w:w="45"/>
-              <w:right w:type="dxa" w:w="100"/>
+              <w:top w:type="dxa" w:w="70"/>
+              <w:left w:type="dxa" w:w="110"/>
+              <w:bottom w:type="dxa" w:w="60"/>
+              <w:right w:type="dxa" w:w="110"/>
             </w:tcMar>
           </w:tcPr>
           <w:p>
@@ -517,10 +428,10 @@
             <w:tcW w:type="dxa" w:w="6196"/>
             <w:shd w:fill="F2F2F2" w:color="auto" w:val="clear"/>
             <w:tcMar>
-              <w:top w:type="dxa" w:w="45"/>
-              <w:left w:type="dxa" w:w="100"/>
-              <w:bottom w:type="dxa" w:w="45"/>
-              <w:right w:type="dxa" w:w="100"/>
+              <w:top w:type="dxa" w:w="70"/>
+              <w:left w:type="dxa" w:w="110"/>
+              <w:bottom w:type="dxa" w:w="60"/>
+              <w:right w:type="dxa" w:w="110"/>
             </w:tcMar>
           </w:tcPr>
           <w:p>
@@ -543,10 +454,10 @@
             <w:tcW w:type="dxa" w:w="2400"/>
             <w:shd w:fill="F2F2F2" w:color="auto" w:val="clear"/>
             <w:tcMar>
-              <w:top w:type="dxa" w:w="45"/>
-              <w:left w:type="dxa" w:w="100"/>
-              <w:bottom w:type="dxa" w:w="45"/>
-              <w:right w:type="dxa" w:w="100"/>
+              <w:top w:type="dxa" w:w="70"/>
+              <w:left w:type="dxa" w:w="110"/>
+              <w:bottom w:type="dxa" w:w="60"/>
+              <w:right w:type="dxa" w:w="110"/>
             </w:tcMar>
           </w:tcPr>
           <w:p>
@@ -568,10 +479,10 @@
           <w:tcPr>
             <w:tcW w:type="dxa" w:w="1150"/>
             <w:tcMar>
-              <w:top w:type="dxa" w:w="45"/>
-              <w:left w:type="dxa" w:w="100"/>
-              <w:bottom w:type="dxa" w:w="45"/>
-              <w:right w:type="dxa" w:w="100"/>
+              <w:top w:type="dxa" w:w="70"/>
+              <w:left w:type="dxa" w:w="110"/>
+              <w:bottom w:type="dxa" w:w="60"/>
+              <w:right w:type="dxa" w:w="110"/>
             </w:tcMar>
           </w:tcPr>
           <w:p>
@@ -588,10 +499,10 @@
           <w:tcPr>
             <w:tcW w:type="dxa" w:w="6196"/>
             <w:tcMar>
-              <w:top w:type="dxa" w:w="45"/>
-              <w:left w:type="dxa" w:w="100"/>
-              <w:bottom w:type="dxa" w:w="45"/>
-              <w:right w:type="dxa" w:w="100"/>
+              <w:top w:type="dxa" w:w="70"/>
+              <w:left w:type="dxa" w:w="110"/>
+              <w:bottom w:type="dxa" w:w="60"/>
+              <w:right w:type="dxa" w:w="110"/>
             </w:tcMar>
           </w:tcPr>
           <w:p>
@@ -623,10 +534,10 @@
           <w:tcPr>
             <w:tcW w:type="dxa" w:w="2400"/>
             <w:tcMar>
-              <w:top w:type="dxa" w:w="45"/>
-              <w:left w:type="dxa" w:w="100"/>
-              <w:bottom w:type="dxa" w:w="45"/>
-              <w:right w:type="dxa" w:w="100"/>
+              <w:top w:type="dxa" w:w="70"/>
+              <w:left w:type="dxa" w:w="110"/>
+              <w:bottom w:type="dxa" w:w="60"/>
+              <w:right w:type="dxa" w:w="110"/>
             </w:tcMar>
           </w:tcPr>
           <w:p>
@@ -649,10 +560,10 @@
             <w:tcW w:type="dxa" w:w="1150"/>
             <w:shd w:fill="F2F2F2" w:color="auto" w:val="clear"/>
             <w:tcMar>
-              <w:top w:type="dxa" w:w="45"/>
-              <w:left w:type="dxa" w:w="100"/>
-              <w:bottom w:type="dxa" w:w="45"/>
-              <w:right w:type="dxa" w:w="100"/>
+              <w:top w:type="dxa" w:w="70"/>
+              <w:left w:type="dxa" w:w="110"/>
+              <w:bottom w:type="dxa" w:w="60"/>
+              <w:right w:type="dxa" w:w="110"/>
             </w:tcMar>
           </w:tcPr>
           <w:p>
@@ -670,10 +581,10 @@
             <w:tcW w:type="dxa" w:w="6196"/>
             <w:shd w:fill="F2F2F2" w:color="auto" w:val="clear"/>
             <w:tcMar>
-              <w:top w:type="dxa" w:w="45"/>
-              <w:left w:type="dxa" w:w="100"/>
-              <w:bottom w:type="dxa" w:w="45"/>
-              <w:right w:type="dxa" w:w="100"/>
+              <w:top w:type="dxa" w:w="70"/>
+              <w:left w:type="dxa" w:w="110"/>
+              <w:bottom w:type="dxa" w:w="60"/>
+              <w:right w:type="dxa" w:w="110"/>
             </w:tcMar>
           </w:tcPr>
           <w:p>
@@ -706,10 +617,10 @@
             <w:tcW w:type="dxa" w:w="2400"/>
             <w:shd w:fill="F2F2F2" w:color="auto" w:val="clear"/>
             <w:tcMar>
-              <w:top w:type="dxa" w:w="45"/>
-              <w:left w:type="dxa" w:w="100"/>
-              <w:bottom w:type="dxa" w:w="45"/>
-              <w:right w:type="dxa" w:w="100"/>
+              <w:top w:type="dxa" w:w="70"/>
+              <w:left w:type="dxa" w:w="110"/>
+              <w:bottom w:type="dxa" w:w="60"/>
+              <w:right w:type="dxa" w:w="110"/>
             </w:tcMar>
           </w:tcPr>
           <w:p>
@@ -731,10 +642,10 @@
           <w:tcPr>
             <w:tcW w:type="dxa" w:w="1150"/>
             <w:tcMar>
-              <w:top w:type="dxa" w:w="45"/>
-              <w:left w:type="dxa" w:w="100"/>
-              <w:bottom w:type="dxa" w:w="45"/>
-              <w:right w:type="dxa" w:w="100"/>
+              <w:top w:type="dxa" w:w="70"/>
+              <w:left w:type="dxa" w:w="110"/>
+              <w:bottom w:type="dxa" w:w="60"/>
+              <w:right w:type="dxa" w:w="110"/>
             </w:tcMar>
           </w:tcPr>
           <w:p>
@@ -751,10 +662,10 @@
           <w:tcPr>
             <w:tcW w:type="dxa" w:w="6196"/>
             <w:tcMar>
-              <w:top w:type="dxa" w:w="45"/>
-              <w:left w:type="dxa" w:w="100"/>
-              <w:bottom w:type="dxa" w:w="45"/>
-              <w:right w:type="dxa" w:w="100"/>
+              <w:top w:type="dxa" w:w="70"/>
+              <w:left w:type="dxa" w:w="110"/>
+              <w:bottom w:type="dxa" w:w="60"/>
+              <w:right w:type="dxa" w:w="110"/>
             </w:tcMar>
           </w:tcPr>
           <w:p>
@@ -786,10 +697,10 @@
           <w:tcPr>
             <w:tcW w:type="dxa" w:w="2400"/>
             <w:tcMar>
-              <w:top w:type="dxa" w:w="45"/>
-              <w:left w:type="dxa" w:w="100"/>
-              <w:bottom w:type="dxa" w:w="45"/>
-              <w:right w:type="dxa" w:w="100"/>
+              <w:top w:type="dxa" w:w="70"/>
+              <w:left w:type="dxa" w:w="110"/>
+              <w:bottom w:type="dxa" w:w="60"/>
+              <w:right w:type="dxa" w:w="110"/>
             </w:tcMar>
           </w:tcPr>
           <w:p>
@@ -1428,7 +1339,7 @@
     </w:rPrDefault>
     <w:pPrDefault>
       <w:pPr>
-        <w:spacing w:after="60" w:line="240" w:lineRule="auto"/>
+        <w:spacing w:after="90" w:line="259" w:lineRule="auto"/>
       </w:pPr>
     </w:pPrDefault>
   </w:docDefaults>

</xml_diff>